<commit_message>
Clarify instructions after independent student trial
</commit_message>
<xml_diff>
--- a/Lab6_Student_Handout.docx
+++ b/Lab6_Student_Handout.docx
@@ -570,6 +570,14 @@
       </w:r>
     </w:p>
     <w:p>
+      <w:r>
+        <w:rPr>
+          <w:b w:val="0"/>
+        </w:rPr>
+        <w:t>Enlarge the terminal before continuing. Keep this same terminal open until S3 is captured so the original pull and push output remains available.</w:t>
+      </w:r>
+    </w:p>
+    <w:p>
       <w:pPr>
         <w:spacing w:after="120" w:line="240" w:lineRule="auto"/>
       </w:pPr>
@@ -843,7 +851,7 @@
         <w:rPr>
           <w:b w:val="0"/>
         </w:rPr>
-        <w:t>Editor: append "Release owner: project manager." to README.md and save.</w:t>
+        <w:t>Editor: open README.md. Add a new last line containing Release owner: project manager. Do not type quotation marks. Save the file.</w:t>
       </w:r>
     </w:p>
     <w:p>

</xml_diff>